<commit_message>
fix permissions approval list
</commit_message>
<xml_diff>
--- a/docs/frd/Functional Requirement Document - Partner Management.docx
+++ b/docs/frd/Functional Requirement Document - Partner Management.docx
@@ -63,7 +63,7 @@
         <w:rPr>
           <w:lang w:val="id-ID"/>
         </w:rPr>
-        <w:t xml:space="preserve">1.1 : Diisi saat terdapat perubahan kebutuhan yang telah disetujui</w:t>
+        <w:t xml:space="preserve">1.1 : Pembaruan keamanan form publik, penyimpanan draft, master wilayah, peta interaktif, halaman sukses, dan monitoring submission, 29 Oktober 2026</w:t>
       </w:r>
     </w:p>
     <w:p ns2:paraId="2B6CCB2B" ns2:textId="5776EC17">
@@ -1295,7 +1295,7 @@
               <w:rPr>
                 <w:lang w:val="id-ID"/>
               </w:rPr>
-              <w:t xml:space="preserve">Input telepon harus menyediakan pilihan negara dengan bendera, kode ISO, dan calling code; nomor lokal hanya menerima angka dan disimpan bersama kode negara.</w:t>
+              <w:t xml:space="preserve">Input telepon dan faks harus menyediakan pilihan negara dengan bendera dan calling code; nomor lokal hanya menerima angka, tidak tertimpa prefix, dan disimpan bersama kode negara.</w:t>
             </w:r>
           </w:p>
         </w:tc>
@@ -1601,7 +1601,7 @@
               <w:rPr>
                 <w:lang w:val="id-ID"/>
               </w:rPr>
-              <w:t xml:space="preserve">Peta dan geocoder harus membantu pencarian lokasi serta menyimpan koordinat per alamat, tetapi kegagalan geocoder tidak boleh menghalangi pengisian alamat manual.</w:t>
+              <w:t xml:space="preserve">Peta dan geocoder harus mendukung pencarian alamat, klik peta, pin yang dapat digeser, reverse geocoding, dan mode layar penuh. Koordinat disimpan per alamat setelah dipilih, sedangkan kegagalan geocoder tidak boleh menghalangi alamat manual.</w:t>
             </w:r>
           </w:p>
         </w:tc>
@@ -2111,7 +2111,7 @@
               <w:rPr>
                 <w:lang w:val="id-ID"/>
               </w:rPr>
-              <w:t xml:space="preserve">Sistem harus menyimpan seluruh data registrasi secara konsisten dalam transaksi dan menampilkan konfirmasi berhasil sebelum mencoba menutup tab setelah lima detik.</w:t>
+              <w:t xml:space="preserve">Sistem harus menyimpan registrasi secara atomik, menampilkan konfirmasi berhasil, mencoba menutup tab setelah lima detik, lalu mengarahkan pengguna ke halaman terima kasih apabila tab tidak dapat ditutup browser.</w:t>
             </w:r>
           </w:p>
         </w:tc>
@@ -3157,6 +3157,618 @@
                 <w:lang w:val="id-ID"/>
               </w:rPr>
               <w:t xml:space="preserve">High</w:t>
+            </w:r>
+          </w:p>
+        </w:tc>
+        <w:tc>
+          <w:tcPr>
+            <w:tcW w:w="2338" w:type="dxa"/>
+          </w:tcPr>
+          <w:p ns2:paraId="56AD7D2E" ns2:textId="1131ED29">
+            <w:pPr>
+              <w:pStyle w:val="ListBullet"/>
+              <w:numPr>
+                <w:ilvl w:val="0"/>
+                <w:numId w:val="0"/>
+              </w:numPr>
+              <w:cnfStyle w:val="000000100000" w:firstRow="0" w:lastRow="0" w:firstColumn="0" w:lastColumn="0" w:oddVBand="0" w:evenVBand="0" w:oddHBand="1" w:evenHBand="0" w:firstRowFirstColumn="0" w:firstRowLastColumn="0" w:lastRowFirstColumn="0" w:lastRowLastColumn="0"/>
+              <w:rPr>
+                <w:lang w:val="id-ID"/>
+              </w:rPr>
+            </w:pPr>
+            <w:r>
+              <w:rPr>
+                <w:lang w:val="id-ID"/>
+              </w:rPr>
+              <w:t xml:space="preserve">ICT Application Development</w:t>
+            </w:r>
+          </w:p>
+        </w:tc>
+      </w:tr>
+      <w:tr ns2:paraId="58A82C88" ns2:textId="77777777">
+        <w:trPr>
+          <w:cnfStyle w:val="000000100000" w:firstRow="0" w:lastRow="0" w:firstColumn="0" w:lastColumn="0" w:oddVBand="0" w:evenVBand="0" w:oddHBand="1" w:evenHBand="0" w:firstRowFirstColumn="0" w:firstRowLastColumn="0" w:lastRowFirstColumn="0" w:lastRowLastColumn="0"/>
+        </w:trPr>
+        <w:tc>
+          <w:tcPr>
+            <w:cnfStyle w:val="001000000000" w:firstRow="0" w:lastRow="0" w:firstColumn="1" w:lastColumn="0" w:oddVBand="0" w:evenVBand="0" w:oddHBand="0" w:evenHBand="0" w:firstRowFirstColumn="0" w:firstRowLastColumn="0" w:lastRowFirstColumn="0" w:lastRowLastColumn="0"/>
+            <w:tcW w:w="562" w:type="dxa"/>
+          </w:tcPr>
+          <w:p ns2:paraId="01083232" ns2:textId="35813CFD">
+            <w:pPr>
+              <w:pStyle w:val="ListBullet"/>
+              <w:numPr>
+                <w:ilvl w:val="0"/>
+                <w:numId w:val="0"/>
+              </w:numPr>
+              <w:rPr>
+                <w:lang w:val="id-ID"/>
+              </w:rPr>
+            </w:pPr>
+            <w:r>
+              <w:rPr>
+                <w:lang w:val="id-ID"/>
+              </w:rPr>
+              <w:t xml:space="preserve">29</w:t>
+            </w:r>
+          </w:p>
+        </w:tc>
+        <w:tc>
+          <w:tcPr>
+            <w:tcW w:w="4112" w:type="dxa"/>
+          </w:tcPr>
+          <w:p ns2:paraId="327A6B60" ns2:textId="4ED7E875">
+            <w:pPr>
+              <w:pStyle w:val="ListBullet"/>
+              <w:numPr>
+                <w:ilvl w:val="0"/>
+                <w:numId w:val="0"/>
+              </w:numPr>
+              <w:cnfStyle w:val="000000100000" w:firstRow="0" w:lastRow="0" w:firstColumn="0" w:lastColumn="0" w:oddVBand="0" w:evenVBand="0" w:oddHBand="1" w:evenHBand="0" w:firstRowFirstColumn="0" w:firstRowLastColumn="0" w:lastRowFirstColumn="0" w:lastRowLastColumn="0"/>
+              <w:rPr>
+                <w:lang w:val="id-ID"/>
+              </w:rPr>
+            </w:pPr>
+            <w:r>
+              <w:rPr>
+                <w:lang w:val="id-ID"/>
+              </w:rPr>
+              <w:t xml:space="preserve">Formulir publik harus menyimpan draft field yang dapat dipulihkan pada session storage per token agar refresh tidak menghapus data yang telah diisi. File, token keamanan, dan data yang tidak aman untuk dipulihkan tidak boleh disimpan; draft dihapus setelah submit berhasil.</w:t>
+            </w:r>
+          </w:p>
+        </w:tc>
+        <w:tc>
+          <w:tcPr>
+            <w:tcW w:w="2338" w:type="dxa"/>
+          </w:tcPr>
+          <w:p ns2:paraId="1D761918" ns2:textId="457B03B3">
+            <w:pPr>
+              <w:pStyle w:val="ListBullet"/>
+              <w:numPr>
+                <w:ilvl w:val="0"/>
+                <w:numId w:val="0"/>
+              </w:numPr>
+              <w:jc w:val="center"/>
+              <w:cnfStyle w:val="000000100000" w:firstRow="0" w:lastRow="0" w:firstColumn="0" w:lastColumn="0" w:oddVBand="0" w:evenVBand="0" w:oddHBand="1" w:evenHBand="0" w:firstRowFirstColumn="0" w:firstRowLastColumn="0" w:lastRowFirstColumn="0" w:lastRowLastColumn="0"/>
+              <w:rPr>
+                <w:lang w:val="id-ID"/>
+              </w:rPr>
+            </w:pPr>
+            <w:r>
+              <w:rPr>
+                <w:lang w:val="id-ID"/>
+              </w:rPr>
+              <w:t xml:space="preserve">High</w:t>
+            </w:r>
+          </w:p>
+        </w:tc>
+        <w:tc>
+          <w:tcPr>
+            <w:tcW w:w="2338" w:type="dxa"/>
+          </w:tcPr>
+          <w:p ns2:paraId="56AD7D2E" ns2:textId="1131ED29">
+            <w:pPr>
+              <w:pStyle w:val="ListBullet"/>
+              <w:numPr>
+                <w:ilvl w:val="0"/>
+                <w:numId w:val="0"/>
+              </w:numPr>
+              <w:cnfStyle w:val="000000100000" w:firstRow="0" w:lastRow="0" w:firstColumn="0" w:lastColumn="0" w:oddVBand="0" w:evenVBand="0" w:oddHBand="1" w:evenHBand="0" w:firstRowFirstColumn="0" w:firstRowLastColumn="0" w:lastRowFirstColumn="0" w:lastRowLastColumn="0"/>
+              <w:rPr>
+                <w:lang w:val="id-ID"/>
+              </w:rPr>
+            </w:pPr>
+            <w:r>
+              <w:rPr>
+                <w:lang w:val="id-ID"/>
+              </w:rPr>
+              <w:t xml:space="preserve">ICT Application Development</w:t>
+            </w:r>
+          </w:p>
+        </w:tc>
+      </w:tr>
+      <w:tr ns2:paraId="58A82C88" ns2:textId="77777777">
+        <w:trPr>
+          <w:cnfStyle w:val="000000100000" w:firstRow="0" w:lastRow="0" w:firstColumn="0" w:lastColumn="0" w:oddVBand="0" w:evenVBand="0" w:oddHBand="1" w:evenHBand="0" w:firstRowFirstColumn="0" w:firstRowLastColumn="0" w:lastRowFirstColumn="0" w:lastRowLastColumn="0"/>
+        </w:trPr>
+        <w:tc>
+          <w:tcPr>
+            <w:cnfStyle w:val="001000000000" w:firstRow="0" w:lastRow="0" w:firstColumn="1" w:lastColumn="0" w:oddVBand="0" w:evenVBand="0" w:oddHBand="0" w:evenHBand="0" w:firstRowFirstColumn="0" w:firstRowLastColumn="0" w:lastRowFirstColumn="0" w:lastRowLastColumn="0"/>
+            <w:tcW w:w="562" w:type="dxa"/>
+          </w:tcPr>
+          <w:p ns2:paraId="01083232" ns2:textId="35813CFD">
+            <w:pPr>
+              <w:pStyle w:val="ListBullet"/>
+              <w:numPr>
+                <w:ilvl w:val="0"/>
+                <w:numId w:val="0"/>
+              </w:numPr>
+              <w:rPr>
+                <w:lang w:val="id-ID"/>
+              </w:rPr>
+            </w:pPr>
+            <w:r>
+              <w:rPr>
+                <w:lang w:val="id-ID"/>
+              </w:rPr>
+              <w:t xml:space="preserve">30</w:t>
+            </w:r>
+          </w:p>
+        </w:tc>
+        <w:tc>
+          <w:tcPr>
+            <w:tcW w:w="4112" w:type="dxa"/>
+          </w:tcPr>
+          <w:p ns2:paraId="327A6B60" ns2:textId="4ED7E875">
+            <w:pPr>
+              <w:pStyle w:val="ListBullet"/>
+              <w:numPr>
+                <w:ilvl w:val="0"/>
+                <w:numId w:val="0"/>
+              </w:numPr>
+              <w:cnfStyle w:val="000000100000" w:firstRow="0" w:lastRow="0" w:firstColumn="0" w:lastColumn="0" w:oddVBand="0" w:evenVBand="0" w:oddHBand="1" w:evenHBand="0" w:firstRowFirstColumn="0" w:firstRowLastColumn="0" w:lastRowFirstColumn="0" w:lastRowLastColumn="0"/>
+              <w:rPr>
+                <w:lang w:val="id-ID"/>
+              </w:rPr>
+            </w:pPr>
+            <w:r>
+              <w:rPr>
+                <w:lang w:val="id-ID"/>
+              </w:rPr>
+              <w:t xml:space="preserve">Submission publik harus memakai idempotency key, transaksi database, dan penguncian yang sesuai agar request paralel atau pengiriman ulang tidak membuat partner, lampiran, atau penghitung submission ganda.</w:t>
+            </w:r>
+          </w:p>
+        </w:tc>
+        <w:tc>
+          <w:tcPr>
+            <w:tcW w:w="2338" w:type="dxa"/>
+          </w:tcPr>
+          <w:p ns2:paraId="1D761918" ns2:textId="457B03B3">
+            <w:pPr>
+              <w:pStyle w:val="ListBullet"/>
+              <w:numPr>
+                <w:ilvl w:val="0"/>
+                <w:numId w:val="0"/>
+              </w:numPr>
+              <w:jc w:val="center"/>
+              <w:cnfStyle w:val="000000100000" w:firstRow="0" w:lastRow="0" w:firstColumn="0" w:lastColumn="0" w:oddVBand="0" w:evenVBand="0" w:oddHBand="1" w:evenHBand="0" w:firstRowFirstColumn="0" w:firstRowLastColumn="0" w:lastRowFirstColumn="0" w:lastRowLastColumn="0"/>
+              <w:rPr>
+                <w:lang w:val="id-ID"/>
+              </w:rPr>
+            </w:pPr>
+            <w:r>
+              <w:rPr>
+                <w:lang w:val="id-ID"/>
+              </w:rPr>
+              <w:t xml:space="preserve">High</w:t>
+            </w:r>
+          </w:p>
+        </w:tc>
+        <w:tc>
+          <w:tcPr>
+            <w:tcW w:w="2338" w:type="dxa"/>
+          </w:tcPr>
+          <w:p ns2:paraId="56AD7D2E" ns2:textId="1131ED29">
+            <w:pPr>
+              <w:pStyle w:val="ListBullet"/>
+              <w:numPr>
+                <w:ilvl w:val="0"/>
+                <w:numId w:val="0"/>
+              </w:numPr>
+              <w:cnfStyle w:val="000000100000" w:firstRow="0" w:lastRow="0" w:firstColumn="0" w:lastColumn="0" w:oddVBand="0" w:evenVBand="0" w:oddHBand="1" w:evenHBand="0" w:firstRowFirstColumn="0" w:firstRowLastColumn="0" w:lastRowFirstColumn="0" w:lastRowLastColumn="0"/>
+              <w:rPr>
+                <w:lang w:val="id-ID"/>
+              </w:rPr>
+            </w:pPr>
+            <w:r>
+              <w:rPr>
+                <w:lang w:val="id-ID"/>
+              </w:rPr>
+              <w:t xml:space="preserve">ICT Application Development</w:t>
+            </w:r>
+          </w:p>
+        </w:tc>
+      </w:tr>
+      <w:tr ns2:paraId="58A82C88" ns2:textId="77777777">
+        <w:trPr>
+          <w:cnfStyle w:val="000000100000" w:firstRow="0" w:lastRow="0" w:firstColumn="0" w:lastColumn="0" w:oddVBand="0" w:evenVBand="0" w:oddHBand="1" w:evenHBand="0" w:firstRowFirstColumn="0" w:firstRowLastColumn="0" w:lastRowFirstColumn="0" w:lastRowLastColumn="0"/>
+        </w:trPr>
+        <w:tc>
+          <w:tcPr>
+            <w:cnfStyle w:val="001000000000" w:firstRow="0" w:lastRow="0" w:firstColumn="1" w:lastColumn="0" w:oddVBand="0" w:evenVBand="0" w:oddHBand="0" w:evenHBand="0" w:firstRowFirstColumn="0" w:firstRowLastColumn="0" w:lastRowFirstColumn="0" w:lastRowLastColumn="0"/>
+            <w:tcW w:w="562" w:type="dxa"/>
+          </w:tcPr>
+          <w:p ns2:paraId="01083232" ns2:textId="35813CFD">
+            <w:pPr>
+              <w:pStyle w:val="ListBullet"/>
+              <w:numPr>
+                <w:ilvl w:val="0"/>
+                <w:numId w:val="0"/>
+              </w:numPr>
+              <w:rPr>
+                <w:lang w:val="id-ID"/>
+              </w:rPr>
+            </w:pPr>
+            <w:r>
+              <w:rPr>
+                <w:lang w:val="id-ID"/>
+              </w:rPr>
+              <w:t xml:space="preserve">31</w:t>
+            </w:r>
+          </w:p>
+        </w:tc>
+        <w:tc>
+          <w:tcPr>
+            <w:tcW w:w="4112" w:type="dxa"/>
+          </w:tcPr>
+          <w:p ns2:paraId="327A6B60" ns2:textId="4ED7E875">
+            <w:pPr>
+              <w:pStyle w:val="ListBullet"/>
+              <w:numPr>
+                <w:ilvl w:val="0"/>
+                <w:numId w:val="0"/>
+              </w:numPr>
+              <w:cnfStyle w:val="000000100000" w:firstRow="0" w:lastRow="0" w:firstColumn="0" w:lastColumn="0" w:oddVBand="0" w:evenVBand="0" w:oddHBand="1" w:evenHBand="0" w:firstRowFirstColumn="0" w:firstRowLastColumn="0" w:lastRowFirstColumn="0" w:lastRowLastColumn="0"/>
+              <w:rPr>
+                <w:lang w:val="id-ID"/>
+              </w:rPr>
+            </w:pPr>
+            <w:r>
+              <w:rPr>
+                <w:lang w:val="id-ID"/>
+              </w:rPr>
+              <w:t xml:space="preserve">Form publik harus dilindungi oleh CSRF, rate limit, security headers, validasi serta escaping server, query terparameterisasi, respons error generik dengan request ID, dan pencatatan keamanan tanpa mengekspos data sensitif.</w:t>
+            </w:r>
+          </w:p>
+        </w:tc>
+        <w:tc>
+          <w:tcPr>
+            <w:tcW w:w="2338" w:type="dxa"/>
+          </w:tcPr>
+          <w:p ns2:paraId="1D761918" ns2:textId="457B03B3">
+            <w:pPr>
+              <w:pStyle w:val="ListBullet"/>
+              <w:numPr>
+                <w:ilvl w:val="0"/>
+                <w:numId w:val="0"/>
+              </w:numPr>
+              <w:jc w:val="center"/>
+              <w:cnfStyle w:val="000000100000" w:firstRow="0" w:lastRow="0" w:firstColumn="0" w:lastColumn="0" w:oddVBand="0" w:evenVBand="0" w:oddHBand="1" w:evenHBand="0" w:firstRowFirstColumn="0" w:firstRowLastColumn="0" w:lastRowFirstColumn="0" w:lastRowLastColumn="0"/>
+              <w:rPr>
+                <w:lang w:val="id-ID"/>
+              </w:rPr>
+            </w:pPr>
+            <w:r>
+              <w:rPr>
+                <w:lang w:val="id-ID"/>
+              </w:rPr>
+              <w:t xml:space="preserve">High</w:t>
+            </w:r>
+          </w:p>
+        </w:tc>
+        <w:tc>
+          <w:tcPr>
+            <w:tcW w:w="2338" w:type="dxa"/>
+          </w:tcPr>
+          <w:p ns2:paraId="56AD7D2E" ns2:textId="1131ED29">
+            <w:pPr>
+              <w:pStyle w:val="ListBullet"/>
+              <w:numPr>
+                <w:ilvl w:val="0"/>
+                <w:numId w:val="0"/>
+              </w:numPr>
+              <w:cnfStyle w:val="000000100000" w:firstRow="0" w:lastRow="0" w:firstColumn="0" w:lastColumn="0" w:oddVBand="0" w:evenVBand="0" w:oddHBand="1" w:evenHBand="0" w:firstRowFirstColumn="0" w:firstRowLastColumn="0" w:lastRowFirstColumn="0" w:lastRowLastColumn="0"/>
+              <w:rPr>
+                <w:lang w:val="id-ID"/>
+              </w:rPr>
+            </w:pPr>
+            <w:r>
+              <w:rPr>
+                <w:lang w:val="id-ID"/>
+              </w:rPr>
+              <w:t xml:space="preserve">ICT Application Development</w:t>
+            </w:r>
+          </w:p>
+        </w:tc>
+      </w:tr>
+      <w:tr ns2:paraId="58A82C88" ns2:textId="77777777">
+        <w:trPr>
+          <w:cnfStyle w:val="000000100000" w:firstRow="0" w:lastRow="0" w:firstColumn="0" w:lastColumn="0" w:oddVBand="0" w:evenVBand="0" w:oddHBand="1" w:evenHBand="0" w:firstRowFirstColumn="0" w:firstRowLastColumn="0" w:lastRowFirstColumn="0" w:lastRowLastColumn="0"/>
+        </w:trPr>
+        <w:tc>
+          <w:tcPr>
+            <w:cnfStyle w:val="001000000000" w:firstRow="0" w:lastRow="0" w:firstColumn="1" w:lastColumn="0" w:oddVBand="0" w:evenVBand="0" w:oddHBand="0" w:evenHBand="0" w:firstRowFirstColumn="0" w:firstRowLastColumn="0" w:lastRowFirstColumn="0" w:lastRowLastColumn="0"/>
+            <w:tcW w:w="562" w:type="dxa"/>
+          </w:tcPr>
+          <w:p ns2:paraId="01083232" ns2:textId="35813CFD">
+            <w:pPr>
+              <w:pStyle w:val="ListBullet"/>
+              <w:numPr>
+                <w:ilvl w:val="0"/>
+                <w:numId w:val="0"/>
+              </w:numPr>
+              <w:rPr>
+                <w:lang w:val="id-ID"/>
+              </w:rPr>
+            </w:pPr>
+            <w:r>
+              <w:rPr>
+                <w:lang w:val="id-ID"/>
+              </w:rPr>
+              <w:t xml:space="preserve">32</w:t>
+            </w:r>
+          </w:p>
+        </w:tc>
+        <w:tc>
+          <w:tcPr>
+            <w:tcW w:w="4112" w:type="dxa"/>
+          </w:tcPr>
+          <w:p ns2:paraId="327A6B60" ns2:textId="4ED7E875">
+            <w:pPr>
+              <w:pStyle w:val="ListBullet"/>
+              <w:numPr>
+                <w:ilvl w:val="0"/>
+                <w:numId w:val="0"/>
+              </w:numPr>
+              <w:cnfStyle w:val="000000100000" w:firstRow="0" w:lastRow="0" w:firstColumn="0" w:lastColumn="0" w:oddVBand="0" w:evenVBand="0" w:oddHBand="1" w:evenHBand="0" w:firstRowFirstColumn="0" w:firstRowLastColumn="0" w:lastRowFirstColumn="0" w:lastRowLastColumn="0"/>
+              <w:rPr>
+                <w:lang w:val="id-ID"/>
+              </w:rPr>
+            </w:pPr>
+            <w:r>
+              <w:rPr>
+                <w:lang w:val="id-ID"/>
+              </w:rPr>
+              <w:t xml:space="preserve">Sistem harus menyediakan importer master wilayah Indonesia yang idempotent untuk provinsi, kota/kabupaten, kecamatan, dan kode pos menggunakan kode wilayah stabil serta mendukung validasi dry-run sebelum data ditulis.</w:t>
+            </w:r>
+          </w:p>
+        </w:tc>
+        <w:tc>
+          <w:tcPr>
+            <w:tcW w:w="2338" w:type="dxa"/>
+          </w:tcPr>
+          <w:p ns2:paraId="1D761918" ns2:textId="457B03B3">
+            <w:pPr>
+              <w:pStyle w:val="ListBullet"/>
+              <w:numPr>
+                <w:ilvl w:val="0"/>
+                <w:numId w:val="0"/>
+              </w:numPr>
+              <w:jc w:val="center"/>
+              <w:cnfStyle w:val="000000100000" w:firstRow="0" w:lastRow="0" w:firstColumn="0" w:lastColumn="0" w:oddVBand="0" w:evenVBand="0" w:oddHBand="1" w:evenHBand="0" w:firstRowFirstColumn="0" w:firstRowLastColumn="0" w:lastRowFirstColumn="0" w:lastRowLastColumn="0"/>
+              <w:rPr>
+                <w:lang w:val="id-ID"/>
+              </w:rPr>
+            </w:pPr>
+            <w:r>
+              <w:rPr>
+                <w:lang w:val="id-ID"/>
+              </w:rPr>
+              <w:t xml:space="preserve">High</w:t>
+            </w:r>
+          </w:p>
+        </w:tc>
+        <w:tc>
+          <w:tcPr>
+            <w:tcW w:w="2338" w:type="dxa"/>
+          </w:tcPr>
+          <w:p ns2:paraId="56AD7D2E" ns2:textId="1131ED29">
+            <w:pPr>
+              <w:pStyle w:val="ListBullet"/>
+              <w:numPr>
+                <w:ilvl w:val="0"/>
+                <w:numId w:val="0"/>
+              </w:numPr>
+              <w:cnfStyle w:val="000000100000" w:firstRow="0" w:lastRow="0" w:firstColumn="0" w:lastColumn="0" w:oddVBand="0" w:evenVBand="0" w:oddHBand="1" w:evenHBand="0" w:firstRowFirstColumn="0" w:firstRowLastColumn="0" w:lastRowFirstColumn="0" w:lastRowLastColumn="0"/>
+              <w:rPr>
+                <w:lang w:val="id-ID"/>
+              </w:rPr>
+            </w:pPr>
+            <w:r>
+              <w:rPr>
+                <w:lang w:val="id-ID"/>
+              </w:rPr>
+              <w:t xml:space="preserve">Super Admin</w:t>
+            </w:r>
+          </w:p>
+        </w:tc>
+      </w:tr>
+      <w:tr ns2:paraId="58A82C88" ns2:textId="77777777">
+        <w:trPr>
+          <w:cnfStyle w:val="000000100000" w:firstRow="0" w:lastRow="0" w:firstColumn="0" w:lastColumn="0" w:oddVBand="0" w:evenVBand="0" w:oddHBand="1" w:evenHBand="0" w:firstRowFirstColumn="0" w:firstRowLastColumn="0" w:lastRowFirstColumn="0" w:lastRowLastColumn="0"/>
+        </w:trPr>
+        <w:tc>
+          <w:tcPr>
+            <w:cnfStyle w:val="001000000000" w:firstRow="0" w:lastRow="0" w:firstColumn="1" w:lastColumn="0" w:oddVBand="0" w:evenVBand="0" w:oddHBand="0" w:evenHBand="0" w:firstRowFirstColumn="0" w:firstRowLastColumn="0" w:lastRowFirstColumn="0" w:lastRowLastColumn="0"/>
+            <w:tcW w:w="562" w:type="dxa"/>
+          </w:tcPr>
+          <w:p ns2:paraId="01083232" ns2:textId="35813CFD">
+            <w:pPr>
+              <w:pStyle w:val="ListBullet"/>
+              <w:numPr>
+                <w:ilvl w:val="0"/>
+                <w:numId w:val="0"/>
+              </w:numPr>
+              <w:rPr>
+                <w:lang w:val="id-ID"/>
+              </w:rPr>
+            </w:pPr>
+            <w:r>
+              <w:rPr>
+                <w:lang w:val="id-ID"/>
+              </w:rPr>
+              <w:t xml:space="preserve">33</w:t>
+            </w:r>
+          </w:p>
+        </w:tc>
+        <w:tc>
+          <w:tcPr>
+            <w:tcW w:w="4112" w:type="dxa"/>
+          </w:tcPr>
+          <w:p ns2:paraId="327A6B60" ns2:textId="4ED7E875">
+            <w:pPr>
+              <w:pStyle w:val="ListBullet"/>
+              <w:numPr>
+                <w:ilvl w:val="0"/>
+                <w:numId w:val="0"/>
+              </w:numPr>
+              <w:cnfStyle w:val="000000100000" w:firstRow="0" w:lastRow="0" w:firstColumn="0" w:lastColumn="0" w:oddVBand="0" w:evenVBand="0" w:oddHBand="1" w:evenHBand="0" w:firstRowFirstColumn="0" w:firstRowLastColumn="0" w:lastRowFirstColumn="0" w:lastRowLastColumn="0"/>
+              <w:rPr>
+                <w:lang w:val="id-ID"/>
+              </w:rPr>
+            </w:pPr>
+            <w:r>
+              <w:rPr>
+                <w:lang w:val="id-ID"/>
+              </w:rPr>
+              <w:t xml:space="preserve">Halaman submission Admin harus menampilkan total dan ringkasan status approval dari seluruh data, pencarian pada data yang tampil, pagination, detail submission, serta riwayat approval dengan tampilan responsif.</w:t>
+            </w:r>
+          </w:p>
+        </w:tc>
+        <w:tc>
+          <w:tcPr>
+            <w:tcW w:w="2338" w:type="dxa"/>
+          </w:tcPr>
+          <w:p ns2:paraId="1D761918" ns2:textId="457B03B3">
+            <w:pPr>
+              <w:pStyle w:val="ListBullet"/>
+              <w:numPr>
+                <w:ilvl w:val="0"/>
+                <w:numId w:val="0"/>
+              </w:numPr>
+              <w:jc w:val="center"/>
+              <w:cnfStyle w:val="000000100000" w:firstRow="0" w:lastRow="0" w:firstColumn="0" w:lastColumn="0" w:oddVBand="0" w:evenVBand="0" w:oddHBand="1" w:evenHBand="0" w:firstRowFirstColumn="0" w:firstRowLastColumn="0" w:lastRowFirstColumn="0" w:lastRowLastColumn="0"/>
+              <w:rPr>
+                <w:lang w:val="id-ID"/>
+              </w:rPr>
+            </w:pPr>
+            <w:r>
+              <w:rPr>
+                <w:lang w:val="id-ID"/>
+              </w:rPr>
+              <w:t xml:space="preserve">Medium</w:t>
+            </w:r>
+          </w:p>
+        </w:tc>
+        <w:tc>
+          <w:tcPr>
+            <w:tcW w:w="2338" w:type="dxa"/>
+          </w:tcPr>
+          <w:p ns2:paraId="56AD7D2E" ns2:textId="1131ED29">
+            <w:pPr>
+              <w:pStyle w:val="ListBullet"/>
+              <w:numPr>
+                <w:ilvl w:val="0"/>
+                <w:numId w:val="0"/>
+              </w:numPr>
+              <w:cnfStyle w:val="000000100000" w:firstRow="0" w:lastRow="0" w:firstColumn="0" w:lastColumn="0" w:oddVBand="0" w:evenVBand="0" w:oddHBand="1" w:evenHBand="0" w:firstRowFirstColumn="0" w:firstRowLastColumn="0" w:lastRowFirstColumn="0" w:lastRowLastColumn="0"/>
+              <w:rPr>
+                <w:lang w:val="id-ID"/>
+              </w:rPr>
+            </w:pPr>
+            <w:r>
+              <w:rPr>
+                <w:lang w:val="id-ID"/>
+              </w:rPr>
+              <w:t xml:space="preserve">Admin Partner Management</w:t>
+            </w:r>
+          </w:p>
+        </w:tc>
+      </w:tr>
+      <w:tr ns2:paraId="58A82C88" ns2:textId="77777777">
+        <w:trPr>
+          <w:cnfStyle w:val="000000100000" w:firstRow="0" w:lastRow="0" w:firstColumn="0" w:lastColumn="0" w:oddVBand="0" w:evenVBand="0" w:oddHBand="1" w:evenHBand="0" w:firstRowFirstColumn="0" w:firstRowLastColumn="0" w:lastRowFirstColumn="0" w:lastRowLastColumn="0"/>
+        </w:trPr>
+        <w:tc>
+          <w:tcPr>
+            <w:cnfStyle w:val="001000000000" w:firstRow="0" w:lastRow="0" w:firstColumn="1" w:lastColumn="0" w:oddVBand="0" w:evenVBand="0" w:oddHBand="0" w:evenHBand="0" w:firstRowFirstColumn="0" w:firstRowLastColumn="0" w:lastRowFirstColumn="0" w:lastRowLastColumn="0"/>
+            <w:tcW w:w="562" w:type="dxa"/>
+          </w:tcPr>
+          <w:p ns2:paraId="01083232" ns2:textId="35813CFD">
+            <w:pPr>
+              <w:pStyle w:val="ListBullet"/>
+              <w:numPr>
+                <w:ilvl w:val="0"/>
+                <w:numId w:val="0"/>
+              </w:numPr>
+              <w:rPr>
+                <w:lang w:val="id-ID"/>
+              </w:rPr>
+            </w:pPr>
+            <w:r>
+              <w:rPr>
+                <w:lang w:val="id-ID"/>
+              </w:rPr>
+              <w:t xml:space="preserve">34</w:t>
+            </w:r>
+          </w:p>
+        </w:tc>
+        <w:tc>
+          <w:tcPr>
+            <w:tcW w:w="4112" w:type="dxa"/>
+          </w:tcPr>
+          <w:p ns2:paraId="327A6B60" ns2:textId="4ED7E875">
+            <w:pPr>
+              <w:pStyle w:val="ListBullet"/>
+              <w:numPr>
+                <w:ilvl w:val="0"/>
+                <w:numId w:val="0"/>
+              </w:numPr>
+              <w:cnfStyle w:val="000000100000" w:firstRow="0" w:lastRow="0" w:firstColumn="0" w:lastColumn="0" w:oddVBand="0" w:evenVBand="0" w:oddHBand="1" w:evenHBand="0" w:firstRowFirstColumn="0" w:firstRowLastColumn="0" w:lastRowFirstColumn="0" w:lastRowLastColumn="0"/>
+              <w:rPr>
+                <w:lang w:val="id-ID"/>
+              </w:rPr>
+            </w:pPr>
+            <w:r>
+              <w:rPr>
+                <w:lang w:val="id-ID"/>
+              </w:rPr>
+              <w:t xml:space="preserve">Formulir harus menyediakan halaman sukses yang aman dan dapat diakses setelah submission berhasil sehingga pengguna memperoleh konfirmasi walaupun browser menolak penutupan tab otomatis.</w:t>
+            </w:r>
+          </w:p>
+        </w:tc>
+        <w:tc>
+          <w:tcPr>
+            <w:tcW w:w="2338" w:type="dxa"/>
+          </w:tcPr>
+          <w:p ns2:paraId="1D761918" ns2:textId="457B03B3">
+            <w:pPr>
+              <w:pStyle w:val="ListBullet"/>
+              <w:numPr>
+                <w:ilvl w:val="0"/>
+                <w:numId w:val="0"/>
+              </w:numPr>
+              <w:jc w:val="center"/>
+              <w:cnfStyle w:val="000000100000" w:firstRow="0" w:lastRow="0" w:firstColumn="0" w:lastColumn="0" w:oddVBand="0" w:evenVBand="0" w:oddHBand="1" w:evenHBand="0" w:firstRowFirstColumn="0" w:firstRowLastColumn="0" w:lastRowFirstColumn="0" w:lastRowLastColumn="0"/>
+              <w:rPr>
+                <w:lang w:val="id-ID"/>
+              </w:rPr>
+            </w:pPr>
+            <w:r>
+              <w:rPr>
+                <w:lang w:val="id-ID"/>
+              </w:rPr>
+              <w:t xml:space="preserve">Medium</w:t>
             </w:r>
           </w:p>
         </w:tc>
@@ -3263,7 +3875,7 @@
         <w:rPr>
           <w:lang w:val="id-ID"/>
         </w:rPr>
-        <w:t xml:space="preserve">Throughput: Baseline transaksi per jam ditetapkan melalui capacity test sebelum produksi. Sistem harus menjaga integritas data ketika beberapa submission atau approval diproses bersamaan.</w:t>
+        <w:t xml:space="preserve">Throughput: Baseline transaksi per jam ditetapkan melalui capacity test sebelum produksi. Sistem harus menjaga integritas data ketika beberapa submission atau approval diproses bersamaan. Submission publik wajib memakai idempotency key dan penguncian transaksi agar pengiriman ulang tidak membuat data atau penghitung ganda.</w:t>
       </w:r>
     </w:p>
     <w:p ns2:paraId="45E0ACBC" ns2:textId="12C508CB">
@@ -3577,7 +4189,7 @@
               <w:rPr>
                 <w:lang w:val="id-ID"/>
               </w:rPr>
-              <w:t xml:space="preserve">Jakarta, 19 Oktober 2026</w:t>
+              <w:t xml:space="preserve">Jakarta, 29 Oktober 2026</w:t>
             </w:r>
           </w:p>
         </w:tc>

</xml_diff>